<commit_message>
Deployment Report template: region is the deploy target, not a parameter
Regenerate both variants after the C5 config-decision fix - 'region parameterisation' reworded to environment parameterisation; the region is set at deploy time, not exposed as a template parameter.

Co-Authored-By: Claude Opus 4.8 <noreply@anthropic.com>
</commit_message>
<xml_diff>
--- a/public/templates/YAT-Deployment-Report-Template-Serverless.docx
+++ b/public/templates/YAT-Deployment-Report-Template-Serverless.docx
@@ -1634,7 +1634,7 @@
               <w:rPr>
                 <w:sz w:val="19"/>
               </w:rPr>
-              <w:t>Region parameterisation</w:t>
+              <w:t>Environment parameterisation</w:t>
             </w:r>
           </w:p>
         </w:tc>
@@ -1676,7 +1676,7 @@
                 <w:color w:val="6B6660"/>
                 <w:sz w:val="19"/>
               </w:rPr>
-              <w:t>[ lab stand-in vs production region ]</w:t>
+              <w:t>[ env values parameterised; the region is the deploy target, not a template parameter ]</w:t>
             </w:r>
           </w:p>
         </w:tc>

</xml_diff>